<commit_message>
removed shites from title and date on een template
</commit_message>
<xml_diff>
--- a/assets/EEN/EENPotpisna lista za seminar.docx
+++ b/assets/EEN/EENPotpisna lista za seminar.docx
@@ -38,21 +38,8 @@
               </w:tabs>
               <w:jc w:val="center"/>
             </w:pPr>
-            <w:proofErr w:type="spellStart"/>
-            <w:r>
-              <w:t>Potpisna</w:t>
-            </w:r>
-            <w:proofErr w:type="spellEnd"/>
-            <w:r>
-              <w:t xml:space="preserve"> </w:t>
-            </w:r>
-            <w:proofErr w:type="spellStart"/>
-            <w:r>
-              <w:t>lista</w:t>
-            </w:r>
-            <w:proofErr w:type="spellEnd"/>
-            <w:r>
-              <w:t xml:space="preserve"> za seminar – “TITLE” – “DATE”</w:t>
+            <w:r>
+              <w:t>Potpisna lista za seminar – TITLE – DATE</w:t>
             </w:r>
           </w:p>
         </w:tc>
@@ -67,445 +54,8 @@
             <w:gridSpan w:val="6"/>
           </w:tcPr>
           <w:p>
-            <w:proofErr w:type="spellStart"/>
-            <w:r>
-              <w:t>Napomena</w:t>
-            </w:r>
-            <w:proofErr w:type="spellEnd"/>
-            <w:r>
-              <w:t xml:space="preserve">: </w:t>
-            </w:r>
-            <w:proofErr w:type="spellStart"/>
-            <w:r>
-              <w:t>Potpisom</w:t>
-            </w:r>
-            <w:proofErr w:type="spellEnd"/>
-            <w:r>
-              <w:t xml:space="preserve"> </w:t>
-            </w:r>
-            <w:proofErr w:type="spellStart"/>
-            <w:r>
-              <w:t>na</w:t>
-            </w:r>
-            <w:proofErr w:type="spellEnd"/>
-            <w:r>
-              <w:t xml:space="preserve"> </w:t>
-            </w:r>
-            <w:proofErr w:type="spellStart"/>
-            <w:r>
-              <w:t>potpisnoj</w:t>
-            </w:r>
-            <w:proofErr w:type="spellEnd"/>
-            <w:r>
-              <w:t xml:space="preserve"> </w:t>
-            </w:r>
-            <w:proofErr w:type="spellStart"/>
-            <w:r>
-              <w:t>listi</w:t>
-            </w:r>
-            <w:proofErr w:type="spellEnd"/>
-            <w:r>
-              <w:t xml:space="preserve"> </w:t>
-            </w:r>
-            <w:proofErr w:type="spellStart"/>
-            <w:r>
-              <w:t>dajem</w:t>
-            </w:r>
-            <w:proofErr w:type="spellEnd"/>
-            <w:r>
-              <w:t xml:space="preserve"> </w:t>
-            </w:r>
-            <w:proofErr w:type="spellStart"/>
-            <w:r>
-              <w:t>svoju</w:t>
-            </w:r>
-            <w:proofErr w:type="spellEnd"/>
-            <w:r>
-              <w:t xml:space="preserve"> </w:t>
-            </w:r>
-            <w:proofErr w:type="spellStart"/>
-            <w:r>
-              <w:t>izričitu</w:t>
-            </w:r>
-            <w:proofErr w:type="spellEnd"/>
-            <w:r>
-              <w:t xml:space="preserve"> </w:t>
-            </w:r>
-            <w:proofErr w:type="spellStart"/>
-            <w:r>
-              <w:t>suglasnost</w:t>
-            </w:r>
-            <w:proofErr w:type="spellEnd"/>
-            <w:r>
-              <w:t xml:space="preserve"> </w:t>
-            </w:r>
-            <w:proofErr w:type="spellStart"/>
-            <w:r>
-              <w:t>i</w:t>
-            </w:r>
-            <w:proofErr w:type="spellEnd"/>
-            <w:r>
-              <w:t xml:space="preserve"> </w:t>
-            </w:r>
-            <w:proofErr w:type="spellStart"/>
-            <w:r>
-              <w:t>privolu</w:t>
-            </w:r>
-            <w:proofErr w:type="spellEnd"/>
-            <w:r>
-              <w:t xml:space="preserve"> da STEP RI </w:t>
-            </w:r>
-            <w:proofErr w:type="spellStart"/>
-            <w:r>
-              <w:t>prikuplja</w:t>
-            </w:r>
-            <w:proofErr w:type="spellEnd"/>
-            <w:r>
-              <w:t xml:space="preserve">, </w:t>
-            </w:r>
-            <w:proofErr w:type="spellStart"/>
-            <w:r>
-              <w:t>obrađuje</w:t>
-            </w:r>
-            <w:proofErr w:type="spellEnd"/>
-            <w:r>
-              <w:t xml:space="preserve"> </w:t>
-            </w:r>
-            <w:proofErr w:type="spellStart"/>
-            <w:r>
-              <w:t>i</w:t>
-            </w:r>
-            <w:proofErr w:type="spellEnd"/>
-            <w:r>
-              <w:t xml:space="preserve"> </w:t>
-            </w:r>
-            <w:proofErr w:type="spellStart"/>
-            <w:r>
-              <w:t>koristi</w:t>
-            </w:r>
-            <w:proofErr w:type="spellEnd"/>
-            <w:r>
-              <w:t xml:space="preserve"> </w:t>
-            </w:r>
-            <w:proofErr w:type="spellStart"/>
-            <w:r>
-              <w:t>moje</w:t>
-            </w:r>
-            <w:proofErr w:type="spellEnd"/>
-            <w:r>
-              <w:t xml:space="preserve"> </w:t>
-            </w:r>
-            <w:proofErr w:type="spellStart"/>
-            <w:r>
-              <w:t>osobne</w:t>
-            </w:r>
-            <w:proofErr w:type="spellEnd"/>
-            <w:r>
-              <w:t xml:space="preserve"> </w:t>
-            </w:r>
-            <w:proofErr w:type="spellStart"/>
-            <w:r>
-              <w:t>podatke</w:t>
-            </w:r>
-            <w:proofErr w:type="spellEnd"/>
-            <w:r>
-              <w:t xml:space="preserve">, </w:t>
-            </w:r>
-            <w:proofErr w:type="spellStart"/>
-            <w:r>
-              <w:t>fotografije</w:t>
-            </w:r>
-            <w:proofErr w:type="spellEnd"/>
-            <w:r>
-              <w:t xml:space="preserve"> </w:t>
-            </w:r>
-            <w:proofErr w:type="spellStart"/>
-            <w:r>
-              <w:t>i</w:t>
-            </w:r>
-            <w:proofErr w:type="spellEnd"/>
-            <w:r>
-              <w:t xml:space="preserve"> </w:t>
-            </w:r>
-            <w:proofErr w:type="spellStart"/>
-            <w:r>
-              <w:t>snimke</w:t>
-            </w:r>
-            <w:proofErr w:type="spellEnd"/>
-            <w:r>
-              <w:t xml:space="preserve"> u </w:t>
-            </w:r>
-            <w:proofErr w:type="spellStart"/>
-            <w:r>
-              <w:t>svrhu</w:t>
-            </w:r>
-            <w:proofErr w:type="spellEnd"/>
-            <w:r>
-              <w:t xml:space="preserve"> </w:t>
-            </w:r>
-            <w:proofErr w:type="spellStart"/>
-            <w:r>
-              <w:t>dokazivanja</w:t>
-            </w:r>
-            <w:proofErr w:type="spellEnd"/>
-            <w:r>
-              <w:t xml:space="preserve"> </w:t>
-            </w:r>
-            <w:proofErr w:type="spellStart"/>
-            <w:r>
-              <w:t>provedene</w:t>
-            </w:r>
-            <w:proofErr w:type="spellEnd"/>
-            <w:r>
-              <w:t xml:space="preserve"> </w:t>
-            </w:r>
-            <w:proofErr w:type="spellStart"/>
-            <w:r>
-              <w:t>aktivnosti</w:t>
-            </w:r>
-            <w:proofErr w:type="spellEnd"/>
-            <w:r>
-              <w:t xml:space="preserve">, </w:t>
-            </w:r>
-            <w:proofErr w:type="spellStart"/>
-            <w:r>
-              <w:t>dostave</w:t>
-            </w:r>
-            <w:proofErr w:type="spellEnd"/>
-            <w:r>
-              <w:t xml:space="preserve"> </w:t>
-            </w:r>
-            <w:proofErr w:type="spellStart"/>
-            <w:r>
-              <w:t>materijala</w:t>
-            </w:r>
-            <w:proofErr w:type="spellEnd"/>
-            <w:r>
-              <w:t xml:space="preserve"> s </w:t>
-            </w:r>
-            <w:proofErr w:type="spellStart"/>
-            <w:r>
-              <w:t>radionica</w:t>
-            </w:r>
-            <w:proofErr w:type="spellEnd"/>
-            <w:r>
-              <w:t xml:space="preserve"> </w:t>
-            </w:r>
-            <w:proofErr w:type="spellStart"/>
-            <w:r>
-              <w:t>te</w:t>
-            </w:r>
-            <w:proofErr w:type="spellEnd"/>
-            <w:r>
-              <w:t xml:space="preserve"> </w:t>
-            </w:r>
-            <w:proofErr w:type="spellStart"/>
-            <w:r>
-              <w:t>promocije</w:t>
-            </w:r>
-            <w:proofErr w:type="spellEnd"/>
-            <w:r>
-              <w:t xml:space="preserve"> </w:t>
-            </w:r>
-            <w:proofErr w:type="spellStart"/>
-            <w:r>
-              <w:t>događanja</w:t>
-            </w:r>
-            <w:proofErr w:type="spellEnd"/>
-            <w:r>
-              <w:t xml:space="preserve"> </w:t>
-            </w:r>
-            <w:proofErr w:type="spellStart"/>
-            <w:r>
-              <w:t>i</w:t>
-            </w:r>
-            <w:proofErr w:type="spellEnd"/>
-            <w:r>
-              <w:t xml:space="preserve"> </w:t>
-            </w:r>
-            <w:proofErr w:type="spellStart"/>
-            <w:r>
-              <w:t>aktivnosti</w:t>
-            </w:r>
-            <w:proofErr w:type="spellEnd"/>
-            <w:r>
-              <w:t xml:space="preserve"> STEPa RI. Isti </w:t>
-            </w:r>
-            <w:proofErr w:type="spellStart"/>
-            <w:r>
-              <w:t>mogu</w:t>
-            </w:r>
-            <w:proofErr w:type="spellEnd"/>
-            <w:r>
-              <w:t xml:space="preserve"> </w:t>
-            </w:r>
-            <w:proofErr w:type="spellStart"/>
-            <w:r>
-              <w:t>biti</w:t>
-            </w:r>
-            <w:proofErr w:type="spellEnd"/>
-            <w:r>
-              <w:t xml:space="preserve"> </w:t>
-            </w:r>
-            <w:proofErr w:type="spellStart"/>
-            <w:r>
-              <w:t>ustupljeni</w:t>
-            </w:r>
-            <w:proofErr w:type="spellEnd"/>
-            <w:r>
-              <w:t xml:space="preserve"> </w:t>
-            </w:r>
-            <w:proofErr w:type="spellStart"/>
-            <w:r>
-              <w:t>trećoj</w:t>
-            </w:r>
-            <w:proofErr w:type="spellEnd"/>
-            <w:r>
-              <w:t xml:space="preserve"> </w:t>
-            </w:r>
-            <w:proofErr w:type="spellStart"/>
-            <w:r>
-              <w:t>strani</w:t>
-            </w:r>
-            <w:proofErr w:type="spellEnd"/>
-            <w:r>
-              <w:t xml:space="preserve"> </w:t>
-            </w:r>
-            <w:proofErr w:type="spellStart"/>
-            <w:r>
-              <w:t>kao</w:t>
-            </w:r>
-            <w:proofErr w:type="spellEnd"/>
-            <w:r>
-              <w:t xml:space="preserve"> </w:t>
-            </w:r>
-            <w:proofErr w:type="spellStart"/>
-            <w:r>
-              <w:t>kontrolnom</w:t>
-            </w:r>
-            <w:proofErr w:type="spellEnd"/>
-            <w:r>
-              <w:t xml:space="preserve"> </w:t>
-            </w:r>
-            <w:proofErr w:type="spellStart"/>
-            <w:r>
-              <w:t>tijelu</w:t>
-            </w:r>
-            <w:proofErr w:type="spellEnd"/>
-            <w:r>
-              <w:t xml:space="preserve"> </w:t>
-            </w:r>
-            <w:proofErr w:type="spellStart"/>
-            <w:r>
-              <w:t>provedbe</w:t>
-            </w:r>
-            <w:proofErr w:type="spellEnd"/>
-            <w:r>
-              <w:t xml:space="preserve"> </w:t>
-            </w:r>
-            <w:proofErr w:type="spellStart"/>
-            <w:r>
-              <w:t>sadržaja</w:t>
-            </w:r>
-            <w:proofErr w:type="spellEnd"/>
-            <w:r>
-              <w:t xml:space="preserve"> </w:t>
-            </w:r>
-            <w:proofErr w:type="spellStart"/>
-            <w:r>
-              <w:t>i</w:t>
-            </w:r>
-            <w:proofErr w:type="spellEnd"/>
-            <w:r>
-              <w:t xml:space="preserve"> </w:t>
-            </w:r>
-            <w:proofErr w:type="spellStart"/>
-            <w:r>
-              <w:t>opsega</w:t>
-            </w:r>
-            <w:proofErr w:type="spellEnd"/>
-            <w:r>
-              <w:t xml:space="preserve"> </w:t>
-            </w:r>
-            <w:proofErr w:type="spellStart"/>
-            <w:r>
-              <w:t>projekta</w:t>
-            </w:r>
-            <w:proofErr w:type="spellEnd"/>
-            <w:r>
-              <w:t xml:space="preserve">, </w:t>
-            </w:r>
-            <w:proofErr w:type="spellStart"/>
-            <w:r>
-              <w:t>ukoliko</w:t>
-            </w:r>
-            <w:proofErr w:type="spellEnd"/>
-            <w:r>
-              <w:t xml:space="preserve"> je </w:t>
-            </w:r>
-            <w:proofErr w:type="spellStart"/>
-            <w:r>
-              <w:t>edukacija</w:t>
-            </w:r>
-            <w:proofErr w:type="spellEnd"/>
-            <w:r>
-              <w:t>/seminar/</w:t>
-            </w:r>
-            <w:proofErr w:type="spellStart"/>
-            <w:r>
-              <w:t>radionica</w:t>
-            </w:r>
-            <w:proofErr w:type="spellEnd"/>
-            <w:r>
-              <w:t xml:space="preserve"> </w:t>
-            </w:r>
-            <w:proofErr w:type="spellStart"/>
-            <w:r>
-              <w:t>organizirana</w:t>
-            </w:r>
-            <w:proofErr w:type="spellEnd"/>
-            <w:r>
-              <w:t xml:space="preserve"> u </w:t>
-            </w:r>
-            <w:proofErr w:type="spellStart"/>
-            <w:r>
-              <w:t>sklopu</w:t>
-            </w:r>
-            <w:proofErr w:type="spellEnd"/>
-            <w:r>
-              <w:t xml:space="preserve"> EU, </w:t>
-            </w:r>
-            <w:proofErr w:type="spellStart"/>
-            <w:r>
-              <w:t>nacionalnih</w:t>
-            </w:r>
-            <w:proofErr w:type="spellEnd"/>
-            <w:r>
-              <w:t xml:space="preserve"> </w:t>
-            </w:r>
-            <w:proofErr w:type="spellStart"/>
-            <w:r>
-              <w:t>i</w:t>
-            </w:r>
-            <w:proofErr w:type="spellEnd"/>
-            <w:r>
-              <w:t xml:space="preserve"> </w:t>
-            </w:r>
-            <w:proofErr w:type="spellStart"/>
-            <w:r>
-              <w:t>međunarodnih</w:t>
-            </w:r>
-            <w:proofErr w:type="spellEnd"/>
-            <w:r>
-              <w:t xml:space="preserve"> </w:t>
-            </w:r>
-            <w:proofErr w:type="spellStart"/>
-            <w:r>
-              <w:t>projekata</w:t>
-            </w:r>
-            <w:proofErr w:type="spellEnd"/>
-            <w:r>
-              <w:t>.</w:t>
+            <w:r>
+              <w:t>Napomena: Potpisom na potpisnoj listi dajem svoju izričitu suglasnost i privolu da STEP RI prikuplja, obrađuje i koristi moje osobne podatke, fotografije i snimke u svrhu dokazivanja provedene aktivnosti, dostave materijala s radionica te promocije događanja i aktivnosti STEPa RI. Isti mogu biti ustupljeni trećoj strani kao kontrolnom tijelu provedbe sadržaja i opsega projekta, ukoliko je edukacija/seminar/radionica organizirana u sklopu EU, nacionalnih i međunarodnih projekata.</w:t>
             </w:r>
           </w:p>
         </w:tc>
@@ -527,53 +77,28 @@
           </w:tcPr>
           <w:p>
             <w:r>
-              <w:t xml:space="preserve">Ime </w:t>
-            </w:r>
-            <w:proofErr w:type="spellStart"/>
-            <w:r>
-              <w:t>i</w:t>
-            </w:r>
-            <w:proofErr w:type="spellEnd"/>
-            <w:r>
-              <w:t xml:space="preserve"> </w:t>
-            </w:r>
-            <w:proofErr w:type="spellStart"/>
-            <w:r>
-              <w:t>prezime</w:t>
-            </w:r>
-            <w:proofErr w:type="spellEnd"/>
-          </w:p>
-        </w:tc>
-        <w:tc>
-          <w:tcPr>
-            <w:tcW w:w="2340" w:type="dxa"/>
-          </w:tcPr>
-          <w:p>
-            <w:proofErr w:type="spellStart"/>
-            <w:r>
-              <w:t>Naziv</w:t>
-            </w:r>
-            <w:proofErr w:type="spellEnd"/>
-            <w:r>
-              <w:t xml:space="preserve"> </w:t>
-            </w:r>
-            <w:proofErr w:type="spellStart"/>
-            <w:r>
-              <w:t>tvrtke</w:t>
-            </w:r>
-            <w:proofErr w:type="spellEnd"/>
-          </w:p>
-        </w:tc>
-        <w:tc>
-          <w:tcPr>
-            <w:tcW w:w="3057" w:type="dxa"/>
-          </w:tcPr>
-          <w:p>
-            <w:proofErr w:type="spellStart"/>
+              <w:t>Ime i prezime</w:t>
+            </w:r>
+          </w:p>
+        </w:tc>
+        <w:tc>
+          <w:tcPr>
+            <w:tcW w:w="2340" w:type="dxa"/>
+          </w:tcPr>
+          <w:p>
+            <w:r>
+              <w:t>Naziv tvrtke</w:t>
+            </w:r>
+          </w:p>
+        </w:tc>
+        <w:tc>
+          <w:tcPr>
+            <w:tcW w:w="3057" w:type="dxa"/>
+          </w:tcPr>
+          <w:p>
             <w:r>
               <w:t>Telefon</w:t>
             </w:r>
-            <w:proofErr w:type="spellEnd"/>
           </w:p>
         </w:tc>
         <w:tc>
@@ -2444,6 +1969,9 @@
       <w:ptab w:relativeTo="margin" w:alignment="right" w:leader="none"/>
     </w:r>
     <w:r>
+      <w:rPr>
+        <w:noProof/>
+      </w:rPr>
       <w:drawing>
         <wp:inline distT="0" distB="0" distL="0" distR="0" wp14:anchorId="18CB8E4D" wp14:editId="2E9E1678">
           <wp:extent cx="1552792" cy="1286054"/>

</xml_diff>